<commit_message>
Correction affiche tarif bar
</commit_message>
<xml_diff>
--- a/tarifs_bar.docx
+++ b/tarifs_bar.docx
@@ -385,7 +385,6 @@
     <w:p/>
     <w:p/>
     <w:p/>
-    <w:p/>
     <w:p>
       <w:pPr>
         <w:rPr>
@@ -399,7 +398,7 @@
       <w:tblPr>
         <w:tblStyle w:val="Grilledutableau"/>
         <w:tblW w:w="0" w:type="auto"/>
-        <w:tblInd w:w="846" w:type="dxa"/>
+        <w:tblInd w:w="279" w:type="dxa"/>
         <w:tblBorders>
           <w:top w:val="none" w:sz="0" w:space="0" w:color="auto"/>
           <w:left w:val="none" w:sz="0" w:space="0" w:color="auto"/>
@@ -411,7 +410,7 @@
         <w:tblLook w:val="04A0" w:firstRow="1" w:lastRow="0" w:firstColumn="1" w:lastColumn="0" w:noHBand="0" w:noVBand="1"/>
       </w:tblPr>
       <w:tblGrid>
-        <w:gridCol w:w="5245"/>
+        <w:gridCol w:w="5812"/>
         <w:gridCol w:w="2686"/>
       </w:tblGrid>
       <w:tr>
@@ -420,7 +419,7 @@
         </w:trPr>
         <w:tc>
           <w:tcPr>
-            <w:tcW w:w="5245" w:type="dxa"/>
+            <w:tcW w:w="5812" w:type="dxa"/>
           </w:tcPr>
           <w:p>
             <w:pPr>
@@ -469,7 +468,7 @@
         </w:trPr>
         <w:tc>
           <w:tcPr>
-            <w:tcW w:w="5245" w:type="dxa"/>
+            <w:tcW w:w="5812" w:type="dxa"/>
           </w:tcPr>
           <w:p>
             <w:pPr>
@@ -479,13 +478,31 @@
                 <w:szCs w:val="40"/>
               </w:rPr>
             </w:pPr>
-            <w:r>
-              <w:rPr>
-                <w:rFonts w:ascii="Luckiest Guy" w:hAnsi="Luckiest Guy"/>
-                <w:sz w:val="40"/>
-                <w:szCs w:val="40"/>
-              </w:rPr>
-              <w:t>bulles et rosé</w:t>
+            <w:proofErr w:type="gramStart"/>
+            <w:r>
+              <w:rPr>
+                <w:rFonts w:ascii="Luckiest Guy" w:hAnsi="Luckiest Guy"/>
+                <w:sz w:val="40"/>
+                <w:szCs w:val="40"/>
+              </w:rPr>
+              <w:t>bulles</w:t>
+            </w:r>
+            <w:proofErr w:type="gramEnd"/>
+            <w:r>
+              <w:rPr>
+                <w:rFonts w:ascii="Luckiest Guy" w:hAnsi="Luckiest Guy"/>
+                <w:sz w:val="40"/>
+                <w:szCs w:val="40"/>
+              </w:rPr>
+              <w:t xml:space="preserve"> et rosé</w:t>
+            </w:r>
+            <w:r>
+              <w:rPr>
+                <w:rFonts w:ascii="Luckiest Guy" w:hAnsi="Luckiest Guy"/>
+                <w:sz w:val="40"/>
+                <w:szCs w:val="40"/>
+              </w:rPr>
+              <w:t xml:space="preserve"> (12.5cl)</w:t>
             </w:r>
           </w:p>
         </w:tc>
@@ -518,7 +535,7 @@
         </w:trPr>
         <w:tc>
           <w:tcPr>
-            <w:tcW w:w="5245" w:type="dxa"/>
+            <w:tcW w:w="5812" w:type="dxa"/>
           </w:tcPr>
           <w:p>
             <w:pPr>
@@ -534,7 +551,58 @@
                 <w:sz w:val="40"/>
                 <w:szCs w:val="40"/>
               </w:rPr>
-              <w:t>Bulles et rosé</w:t>
+              <w:t xml:space="preserve">Bouteilles </w:t>
+            </w:r>
+            <w:r>
+              <w:rPr>
+                <w:rFonts w:ascii="Luckiest Guy" w:hAnsi="Luckiest Guy"/>
+                <w:sz w:val="40"/>
+                <w:szCs w:val="40"/>
+              </w:rPr>
+              <w:t xml:space="preserve">Bulles </w:t>
+            </w:r>
+            <w:proofErr w:type="gramStart"/>
+            <w:r>
+              <w:rPr>
+                <w:rFonts w:ascii="Luckiest Guy" w:hAnsi="Luckiest Guy"/>
+                <w:sz w:val="40"/>
+                <w:szCs w:val="40"/>
+              </w:rPr>
+              <w:t>ou</w:t>
+            </w:r>
+            <w:proofErr w:type="gramEnd"/>
+          </w:p>
+          <w:p>
+            <w:pPr>
+              <w:rPr>
+                <w:rFonts w:ascii="Luckiest Guy" w:hAnsi="Luckiest Guy"/>
+              </w:rPr>
+            </w:pPr>
+            <w:proofErr w:type="gramStart"/>
+            <w:r>
+              <w:rPr>
+                <w:rFonts w:ascii="Luckiest Guy" w:hAnsi="Luckiest Guy"/>
+                <w:sz w:val="40"/>
+                <w:szCs w:val="40"/>
+              </w:rPr>
+              <w:t>rosé</w:t>
+            </w:r>
+            <w:proofErr w:type="gramEnd"/>
+            <w:r>
+              <w:rPr>
+                <w:rFonts w:ascii="Luckiest Guy" w:hAnsi="Luckiest Guy"/>
+                <w:sz w:val="40"/>
+                <w:szCs w:val="40"/>
+              </w:rPr>
+              <w:t xml:space="preserve"> 75cl</w:t>
+            </w:r>
+            <w:r>
+              <w:rPr>
+                <w:rFonts w:ascii="Luckiest Guy" w:hAnsi="Luckiest Guy"/>
+                <w:sz w:val="40"/>
+                <w:szCs w:val="40"/>
+              </w:rPr>
+              <w:br/>
             </w:r>
           </w:p>
         </w:tc>
@@ -567,7 +635,7 @@
         </w:trPr>
         <w:tc>
           <w:tcPr>
-            <w:tcW w:w="5245" w:type="dxa"/>
+            <w:tcW w:w="5812" w:type="dxa"/>
           </w:tcPr>
           <w:p>
             <w:pPr>
@@ -584,6 +652,14 @@
                 <w:szCs w:val="40"/>
               </w:rPr>
               <w:t>Coca, oasis, thé glacé </w:t>
+            </w:r>
+            <w:r>
+              <w:rPr>
+                <w:rFonts w:ascii="Luckiest Guy" w:hAnsi="Luckiest Guy"/>
+                <w:sz w:val="40"/>
+                <w:szCs w:val="40"/>
+              </w:rPr>
+              <w:t>(25cl)</w:t>
             </w:r>
           </w:p>
         </w:tc>
@@ -616,7 +692,7 @@
         </w:trPr>
         <w:tc>
           <w:tcPr>
-            <w:tcW w:w="5245" w:type="dxa"/>
+            <w:tcW w:w="5812" w:type="dxa"/>
           </w:tcPr>
           <w:p>
             <w:pPr>
@@ -633,6 +709,14 @@
                 <w:szCs w:val="40"/>
               </w:rPr>
               <w:t>Eau</w:t>
+            </w:r>
+            <w:r>
+              <w:rPr>
+                <w:rFonts w:ascii="Luckiest Guy" w:hAnsi="Luckiest Guy"/>
+                <w:sz w:val="40"/>
+                <w:szCs w:val="40"/>
+              </w:rPr>
+              <w:t xml:space="preserve"> (0.5l)</w:t>
             </w:r>
           </w:p>
         </w:tc>
@@ -665,7 +749,7 @@
         </w:trPr>
         <w:tc>
           <w:tcPr>
-            <w:tcW w:w="5245" w:type="dxa"/>
+            <w:tcW w:w="5812" w:type="dxa"/>
           </w:tcPr>
           <w:p>
             <w:pPr>
@@ -682,6 +766,14 @@
                 <w:szCs w:val="40"/>
               </w:rPr>
               <w:t>Eau</w:t>
+            </w:r>
+            <w:r>
+              <w:rPr>
+                <w:rFonts w:ascii="Luckiest Guy" w:hAnsi="Luckiest Guy"/>
+                <w:sz w:val="40"/>
+                <w:szCs w:val="40"/>
+              </w:rPr>
+              <w:t xml:space="preserve"> (1.5L)</w:t>
             </w:r>
           </w:p>
         </w:tc>
@@ -710,18 +802,18 @@
       </w:tr>
       <w:tr>
         <w:trPr>
-          <w:trHeight w:val="737"/>
+          <w:trHeight w:val="229"/>
         </w:trPr>
         <w:tc>
           <w:tcPr>
-            <w:tcW w:w="5245" w:type="dxa"/>
+            <w:tcW w:w="5812" w:type="dxa"/>
           </w:tcPr>
           <w:p>
             <w:pPr>
               <w:rPr>
                 <w:rFonts w:ascii="Luckiest Guy" w:hAnsi="Luckiest Guy"/>
-                <w:sz w:val="40"/>
-                <w:szCs w:val="40"/>
+                <w:sz w:val="24"/>
+                <w:szCs w:val="24"/>
               </w:rPr>
             </w:pPr>
           </w:p>
@@ -747,7 +839,7 @@
         </w:trPr>
         <w:tc>
           <w:tcPr>
-            <w:tcW w:w="5245" w:type="dxa"/>
+            <w:tcW w:w="5812" w:type="dxa"/>
           </w:tcPr>
           <w:p>
             <w:pPr>
@@ -796,7 +888,7 @@
         </w:trPr>
         <w:tc>
           <w:tcPr>
-            <w:tcW w:w="5245" w:type="dxa"/>
+            <w:tcW w:w="5812" w:type="dxa"/>
           </w:tcPr>
           <w:p>
             <w:pPr>

</xml_diff>